<commit_message>
fix: docx image import/export — extract media, embed as base64, fix line spacing
- Import: add --extract-media to pandoc, convert extracted images and
  HTML <img> tags to base64 data URIs for editor display
- Export: post-process docx to change lineRule="exact" to "atLeast",
  preventing images from being clipped by fixed line height
- Export: add --from markdown-implicit_figures to prevent float positioning
- Update reference.docx to use atLeast line spacing
- Add regex and base64 crate dependencies

Co-Authored-By: Claude Opus 4.6 <noreply@anthropic.com>
</commit_message>
<xml_diff>
--- a/src-tauri/resources/reference.docx
+++ b/src-tauri/resources/reference.docx
@@ -546,7 +546,7 @@
     <w:uiPriority w:val="10"/>
     <w:qFormat/>
     <w:pPr>
-      <w:spacing w:before="240" w:after="160" w:line="720" w:lineRule="exact"/>
+      <w:spacing w:before="240" w:after="160" w:line="720" w:lineRule="atLeast"/>
       <w:jc w:val="center"/>
     </w:pPr>
     <w:rPr>
@@ -579,7 +579,7 @@
     <w:uiPriority w:val="11"/>
     <w:qFormat/>
     <w:pPr>
-      <w:spacing w:before="100" w:after="200" w:line="600" w:lineRule="exact"/>
+      <w:spacing w:before="100" w:after="200" w:line="600" w:lineRule="atLeast"/>
     </w:pPr>
     <w:rPr>
       <w:b w:val="0"/>
@@ -664,7 +664,7 @@
     <w:pPr>
       <w:keepNext/>
       <w:keepLines/>
-      <w:spacing w:before="360" w:after="160" w:line="640" w:lineRule="exact"/>
+      <w:spacing w:before="360" w:after="160" w:line="640" w:lineRule="atLeast"/>
       <w:outlineLvl w:val="0"/>
     </w:pPr>
     <w:rPr>
@@ -700,7 +700,7 @@
     <w:pPr>
       <w:keepNext/>
       <w:keepLines/>
-      <w:spacing w:before="260" w:after="120" w:line="600" w:lineRule="exact"/>
+      <w:spacing w:before="260" w:after="120" w:line="600" w:lineRule="atLeast"/>
       <w:outlineLvl w:val="1"/>
     </w:pPr>
     <w:rPr>
@@ -736,7 +736,7 @@
     <w:pPr>
       <w:keepNext/>
       <w:keepLines/>
-      <w:spacing w:before="200" w:after="100" w:line="560" w:lineRule="exact"/>
+      <w:spacing w:before="200" w:after="100" w:line="560" w:lineRule="atLeast"/>
       <w:outlineLvl w:val="2"/>
     </w:pPr>
     <w:rPr>
@@ -938,7 +938,7 @@
     <w:unhideWhenUsed/>
     <w:qFormat/>
     <w:pPr>
-      <w:spacing w:line="400" w:lineRule="exact"/>
+      <w:spacing w:line="400" w:lineRule="atLeast"/>
     </w:pPr>
     <w:rPr>
       <w:sz w:val="18"/>

</xml_diff>